<commit_message>
Trusteando Protocol whitepaper v0.2
</commit_message>
<xml_diff>
--- a/whitepaper/trusteando_whitepaper_v02.docx
+++ b/whitepaper/trusteando_whitepaper_v02.docx
@@ -136,7 +136,230 @@
           <w:sz w:val="21"/>
           <w:szCs w:val="21"/>
         </w:rPr>
-        <w:t xml:space="preserve">Trusteando is an open protocol for a decentralised, cryptographically verifiable Knowledge Graph. Entities — universities, companies, professional bodies, individuals — are nodes identified by the hash of their public URL or by an autonomously generated identifier anchored in a locally held secret. Relations between nodes are expressed as folder structures published by each entity in its own web space. The folder structure is the credential: there is no credential information outside it. Any entity with a web presence can act as an identity issuer for the entities it recognises, using a chain of shared keys established via Diffie-Hellman key exchange, with authorship guaranteed by ECDSA signatures. The graph is dynamic: temporal dimension is encoded in since/until folder conventions, giving the graph full verifiable history. Active processes are expressed via the plan/execution convention, separating intention from execution with independent authorship. The path grammar extends the folder structure with relational operators [relation] and property literals [key value], enabling paths to express context, properties and reciprocal relations directly without introducing new reserved characters. Identity is portable across migrations via an emergency key mechanism — the receiving entity publishes and signs the full chain of prior identities in its own old_identities table, outside the control of the migrating node. Recognition is distributed across a quorum of independent roots: any sufficiently reputable node can act as a root by executing the same public algorithm, enabling ecosystems of thousands of roots from which entities choose freely. A root holds no privileged state and has no discretion — it only executes a public algorithm. This makes the system polycentric by design from inception, without requiring blockchain. When adopted by public administrations and organisations, the folder schema acts as a universal interoperability contract: any system that exposes its data respecting the schema becomes interoperable by construction with any other that does the same, without bilateral agreements or intermediary platforms. Membership precedes recognition. Contextual trust suffices for most verification. Cryptographic verification handles the rest.</w:t>
+        <w:t xml:space="preserve">Trusteando is an open protocol for a decentralised, cryptographically verifiable Knowledge Graph. Its core is a class with five functions — fewer than twenty lines of code — from which the entire system emerges:</w:t>
+      </w:r>
+    </w:p>
+    <w:p>
+      <w:pPr>
+        <w:shd w:fill="F0F4F8" w:val="clear"/>
+        <w:spacing w:before="120" w:after="0"/>
+        <w:ind w:left="400" w:right="400"/>
+      </w:pPr>
+    </w:p>
+    <w:p>
+      <w:pPr>
+        <w:shd w:fill="F0F4F8" w:val="clear"/>
+        <w:spacing w:before="0" w:after="0"/>
+        <w:ind w:left="400" w:right="400"/>
+      </w:pPr>
+      <w:r>
+        <w:rPr>
+          <w:rFonts w:ascii="Courier New" w:cs="Courier New" w:eastAsia="Courier New" w:hAnsi="Courier New"/>
+          <w:color w:val="1A3A5C"/>
+          <w:sz w:val="18"/>
+          <w:szCs w:val="18"/>
+        </w:rPr>
+        <w:t xml:space="preserve">class TrusteandoNode:</w:t>
+      </w:r>
+    </w:p>
+    <w:p>
+      <w:pPr>
+        <w:shd w:fill="F0F4F8" w:val="clear"/>
+        <w:spacing w:before="0" w:after="0"/>
+        <w:ind w:left="400" w:right="400"/>
+      </w:pPr>
+      <w:r>
+        <w:rPr>
+          <w:rFonts w:ascii="Courier New" w:cs="Courier New" w:eastAsia="Courier New" w:hAnsi="Courier New"/>
+          <w:color w:val="1A3A5C"/>
+          <w:sz w:val="18"/>
+          <w:szCs w:val="18"/>
+        </w:rPr>
+        <w:t xml:space="preserve">    def __init__(self, key): self.key = key</w:t>
+      </w:r>
+    </w:p>
+    <w:p>
+      <w:pPr>
+        <w:shd w:fill="F0F4F8" w:val="clear"/>
+        <w:spacing w:before="0" w:after="0"/>
+        <w:ind w:left="400" w:right="400"/>
+      </w:pPr>
+      <w:r>
+        <w:rPr>
+          <w:rFonts w:ascii="Courier New" w:cs="Courier New" w:eastAsia="Courier New" w:hAnsi="Courier New"/>
+          <w:color w:val="1A3A5C"/>
+          <w:sz w:val="18"/>
+          <w:szCs w:val="18"/>
+        </w:rPr>
+        <w:t xml:space="preserve">    @staticmethod</w:t>
+      </w:r>
+    </w:p>
+    <w:p>
+      <w:pPr>
+        <w:shd w:fill="F0F4F8" w:val="clear"/>
+        <w:spacing w:before="0" w:after="0"/>
+        <w:ind w:left="400" w:right="400"/>
+      </w:pPr>
+      <w:r>
+        <w:rPr>
+          <w:rFonts w:ascii="Courier New" w:cs="Courier New" w:eastAsia="Courier New" w:hAnsi="Courier New"/>
+          <w:color w:val="1A3A5C"/>
+          <w:sz w:val="18"/>
+          <w:szCs w:val="18"/>
+        </w:rPr>
+        <w:t xml:space="preserve">    def reduce_hash(seed, elements):</w:t>
+      </w:r>
+    </w:p>
+    <w:p>
+      <w:pPr>
+        <w:shd w:fill="F0F4F8" w:val="clear"/>
+        <w:spacing w:before="0" w:after="0"/>
+        <w:ind w:left="400" w:right="400"/>
+      </w:pPr>
+      <w:r>
+        <w:rPr>
+          <w:rFonts w:ascii="Courier New" w:cs="Courier New" w:eastAsia="Courier New" w:hAnsi="Courier New"/>
+          <w:color w:val="1A3A5C"/>
+          <w:sz w:val="18"/>
+          <w:szCs w:val="18"/>
+        </w:rPr>
+        <w:t xml:space="preserve">        for e in elements: seed = hash(seed + e)</w:t>
+      </w:r>
+    </w:p>
+    <w:p>
+      <w:pPr>
+        <w:shd w:fill="F0F4F8" w:val="clear"/>
+        <w:spacing w:before="0" w:after="0"/>
+        <w:ind w:left="400" w:right="400"/>
+      </w:pPr>
+      <w:r>
+        <w:rPr>
+          <w:rFonts w:ascii="Courier New" w:cs="Courier New" w:eastAsia="Courier New" w:hAnsi="Courier New"/>
+          <w:color w:val="1A3A5C"/>
+          <w:sz w:val="18"/>
+          <w:szCs w:val="18"/>
+        </w:rPr>
+        <w:t xml:space="preserve">        return seed</w:t>
+      </w:r>
+    </w:p>
+    <w:p>
+      <w:pPr>
+        <w:shd w:fill="F0F4F8" w:val="clear"/>
+        <w:spacing w:before="0" w:after="0"/>
+        <w:ind w:left="400" w:right="400"/>
+      </w:pPr>
+      <w:r>
+        <w:rPr>
+          <w:rFonts w:ascii="Courier New" w:cs="Courier New" w:eastAsia="Courier New" w:hAnsi="Courier New"/>
+          <w:color w:val="1A3A5C"/>
+          <w:sz w:val="18"/>
+          <w:szCs w:val="18"/>
+        </w:rPr>
+        <w:t xml:space="preserve">    def grant_key(self, child):</w:t>
+      </w:r>
+    </w:p>
+    <w:p>
+      <w:pPr>
+        <w:shd w:fill="F0F4F8" w:val="clear"/>
+        <w:spacing w:before="0" w:after="0"/>
+        <w:ind w:left="400" w:right="400"/>
+      </w:pPr>
+      <w:r>
+        <w:rPr>
+          <w:rFonts w:ascii="Courier New" w:cs="Courier New" w:eastAsia="Courier New" w:hAnsi="Courier New"/>
+          <w:color w:val="1A3A5C"/>
+          <w:sz w:val="18"/>
+          <w:szCs w:val="18"/>
+        </w:rPr>
+        <w:t xml:space="preserve">        return hash(self.key + child)</w:t>
+      </w:r>
+    </w:p>
+    <w:p>
+      <w:pPr>
+        <w:shd w:fill="F0F4F8" w:val="clear"/>
+        <w:spacing w:before="0" w:after="0"/>
+        <w:ind w:left="400" w:right="400"/>
+      </w:pPr>
+      <w:r>
+        <w:rPr>
+          <w:rFonts w:ascii="Courier New" w:cs="Courier New" w:eastAsia="Courier New" w:hAnsi="Courier New"/>
+          <w:color w:val="1A3A5C"/>
+          <w:sz w:val="18"/>
+          <w:szCs w:val="18"/>
+        </w:rPr>
+        <w:t xml:space="preserve">    def respond_to_challenge(self, ctx):</w:t>
+      </w:r>
+    </w:p>
+    <w:p>
+      <w:pPr>
+        <w:shd w:fill="F0F4F8" w:val="clear"/>
+        <w:spacing w:before="0" w:after="0"/>
+        <w:ind w:left="400" w:right="400"/>
+      </w:pPr>
+      <w:r>
+        <w:rPr>
+          <w:rFonts w:ascii="Courier New" w:cs="Courier New" w:eastAsia="Courier New" w:hAnsi="Courier New"/>
+          <w:color w:val="1A3A5C"/>
+          <w:sz w:val="18"/>
+          <w:szCs w:val="18"/>
+        </w:rPr>
+        <w:t xml:space="preserve">        return self.reduce_hash(self.key, ctx)</w:t>
+      </w:r>
+    </w:p>
+    <w:p>
+      <w:pPr>
+        <w:shd w:fill="F0F4F8" w:val="clear"/>
+        <w:spacing w:before="0" w:after="0"/>
+        <w:ind w:left="400" w:right="400"/>
+      </w:pPr>
+      <w:r>
+        <w:rPr>
+          <w:rFonts w:ascii="Courier New" w:cs="Courier New" w:eastAsia="Courier New" w:hAnsi="Courier New"/>
+          <w:color w:val="1A3A5C"/>
+          <w:sz w:val="18"/>
+          <w:szCs w:val="18"/>
+        </w:rPr>
+        <w:t xml:space="preserve">    def verify_child_authorship(self, child, ctx, proof):</w:t>
+      </w:r>
+    </w:p>
+    <w:p>
+      <w:pPr>
+        <w:shd w:fill="F0F4F8" w:val="clear"/>
+        <w:spacing w:before="0" w:after="0"/>
+        <w:ind w:left="400" w:right="400"/>
+      </w:pPr>
+      <w:r>
+        <w:rPr>
+          <w:rFonts w:ascii="Courier New" w:cs="Courier New" w:eastAsia="Courier New" w:hAnsi="Courier New"/>
+          <w:color w:val="1A3A5C"/>
+          <w:sz w:val="18"/>
+          <w:szCs w:val="18"/>
+        </w:rPr>
+        <w:t xml:space="preserve">        return self.reduce_hash(self.grant_key(child), ctx) == proof</w:t>
+      </w:r>
+    </w:p>
+    <w:p>
+      <w:pPr>
+        <w:shd w:fill="F0F4F8" w:val="clear"/>
+        <w:spacing w:before="0" w:after="120"/>
+        <w:ind w:left="400" w:right="400"/>
+      </w:pPr>
+    </w:p>
+    <w:p>
+      <w:pPr>
+        <w:spacing w:before="80" w:after="80"/>
+        <w:jc w:val="both"/>
+      </w:pPr>
+      <w:r>
+        <w:rPr>
+          <w:rFonts w:ascii="Arial" w:cs="Arial" w:eastAsia="Arial" w:hAnsi="Arial"/>
+          <w:i/>
+          <w:iCs/>
+          <w:color w:val="333333"/>
+          <w:sz w:val="21"/>
+          <w:szCs w:val="21"/>
+        </w:rPr>
+        <w:t xml:space="preserve">From this simplicity the entire protocol emerges: identity, authentication, authorisation, hierarchies, privacy and portability. Nodes are entities identified by the hash of their public URL or by an autonomously generated identifier. Relations are expressed as folder structures published by each entity in its own web space — the folder structure is the credential. Trust chains are established via hierarchically derived keys: each node receives its key from its parent via grant_key, and any interaction is proven with respond_to_challenge without revealing keys. The graph is dynamic with full verifiable history via since/until and plan/execution conventions. Identity is portable via an emergency key mechanism and old_identities tables published by receiving entities. The system is polycentric by design: any sufficiently reputable node can act as a root by executing the same public algorithm, without requiring blockchain. When adopted by public administrations, the folder schema acts as a universal interoperability contract: any system that exposes its data respecting the schema becomes interoperable by construction with any other, without bilateral agreements or intermediary platforms. Membership precedes recognition. Contextual trust suffices for most verification. Cryptographic verification handles the rest.</w:t>
       </w:r>
     </w:p>
     <w:p>
@@ -213,6 +436,65 @@
           <w:szCs w:val="22"/>
         </w:rPr>
         <w:t xml:space="preserve">Trusteando es ese protocolo. Los nodos del grafo son entidades identificadas por el hash de su URL pública. Las aristas son relaciones expresadas como estructuras de carpetas publicadas por cada entidad en su propio espacio web. La firma criptográfica de cada entidad sobre su propio espacio garantiza la integridad. La cadena de confianza entre niveles permite la verificación sin depender de ningún servidor central en el uso cotidiano.</w:t>
+      </w:r>
+    </w:p>
+    <w:p>
+      <w:pPr>
+        <w:pStyle w:val="Heading2"/>
+        <w:spacing w:before="320" w:after="140"/>
+      </w:pPr>
+      <w:r>
+        <w:rPr>
+          <w:rFonts w:ascii="Arial" w:cs="Arial" w:eastAsia="Arial" w:hAnsi="Arial"/>
+          <w:b/>
+          <w:bCs/>
+          <w:color w:val="2C3E7A"/>
+          <w:sz w:val="26"/>
+          <w:szCs w:val="26"/>
+        </w:rPr>
+        <w:t xml:space="preserve">1.1 Una red paralela sobre la misma web</w:t>
+      </w:r>
+    </w:p>
+    <w:p>
+      <w:pPr>
+        <w:spacing w:before="80" w:after="160"/>
+        <w:jc w:val="both"/>
+      </w:pPr>
+      <w:r>
+        <w:rPr>
+          <w:rFonts w:ascii="Arial" w:cs="Arial" w:eastAsia="Arial" w:hAnsi="Arial"/>
+          <w:sz w:val="22"/>
+          <w:szCs w:val="22"/>
+        </w:rPr>
+        <w:t xml:space="preserve">Trusteando no compite con la web — se superpone a ella. Cada entidad que publica una carpeta trusteando/ en su dominio añade un nodo a una red paralela que corre sobre la misma infraestructura HTTP, los mismos servidores, las mismas URLs. La diferencia es lo que esa carpeta contiene: no HTML para consumo humano sino estructuras de carpetas que expresan hechos verificables criptográficamente.</w:t>
+      </w:r>
+    </w:p>
+    <w:p>
+      <w:pPr>
+        <w:spacing w:before="80" w:after="160"/>
+        <w:jc w:val="both"/>
+      </w:pPr>
+      <w:r>
+        <w:rPr>
+          <w:rFonts w:ascii="Arial" w:cs="Arial" w:eastAsia="Arial" w:hAnsi="Arial"/>
+          <w:sz w:val="22"/>
+          <w:szCs w:val="22"/>
+        </w:rPr>
+        <w:t xml:space="preserve">La web dice: existe este documento. Trusteando dice: existe esta relación, y está verificada por quien tiene autoridad sobre ella. Esa distinción permite representar con precisión cualquier estructura organizativa — universidades con sus facultades, empresas con sus departamentos, estados con sus administraciones — y controlar de forma granular quién puede certificar qué sobre quién. La jerarquía de carpetas refleja la jerarquía real, y la criptografía garantiza que solo quien tiene autoridad puede emitir credenciales en su ámbito.</w:t>
+      </w:r>
+    </w:p>
+    <w:p>
+      <w:pPr>
+        <w:spacing w:before="80" w:after="160"/>
+        <w:jc w:val="both"/>
+      </w:pPr>
+      <w:r>
+        <w:rPr>
+          <w:rFonts w:ascii="Arial" w:cs="Arial" w:eastAsia="Arial" w:hAnsi="Arial"/>
+          <w:sz w:val="22"/>
+          <w:szCs w:val="22"/>
+        </w:rPr>
+        <w:t xml:space="preserve">Ambas capas usan la misma infraestructura. Solo cambian las reglas.</w:t>
       </w:r>
     </w:p>
     <w:p>
@@ -1451,6 +1733,51 @@
           <w:szCs w:val="22"/>
         </w:rPr>
         <w:t xml:space="preserve">La analogía con programación orientada a objetos es ilustrativa pero incompleta: a diferencia de una clase con estado privado, aquí no hay encapsulación por defecto. Todo es público salvo lo que se oculta explícitamente. Es más cercano a un record inmutable en un lenguaje funcional: las propiedades firmadas no se modifican, las correcciones añaden nuevos registros, y el historial completo es siempre accesible.</w:t>
+      </w:r>
+    </w:p>
+    <w:p>
+      <w:pPr>
+        <w:pStyle w:val="Heading2"/>
+        <w:spacing w:before="320" w:after="140"/>
+      </w:pPr>
+      <w:r>
+        <w:rPr>
+          <w:rFonts w:ascii="Arial" w:cs="Arial" w:eastAsia="Arial" w:hAnsi="Arial"/>
+          <w:b/>
+          <w:bCs/>
+          <w:color w:val="2C3E7A"/>
+          <w:sz w:val="26"/>
+          <w:szCs w:val="26"/>
+        </w:rPr>
+        <w:t xml:space="preserve">2.12 La jerarquía de carpetas es la jerarquía de claves</w:t>
+      </w:r>
+    </w:p>
+    <w:p>
+      <w:pPr>
+        <w:spacing w:before="80" w:after="160"/>
+        <w:jc w:val="both"/>
+      </w:pPr>
+      <w:r>
+        <w:rPr>
+          <w:rFonts w:ascii="Arial" w:cs="Arial" w:eastAsia="Arial" w:hAnsi="Arial"/>
+          <w:sz w:val="22"/>
+          <w:szCs w:val="22"/>
+        </w:rPr>
+        <w:t xml:space="preserve">El protocolo tiene una propiedad estructural que conecta su organización visible con su fundamento criptográfico: la jerarquía de carpetas y la jerarquía de claves son isomorfas. Cada carpeta es un nodo, y cada nodo tiene una clave derivada directamente de su posición en el árbol. Recorrer el árbol de carpetas es verificar la cadena criptográfica. No hay infraestructura de clave pública separada — la estructura de carpetas es la infraestructura criptográfica.</w:t>
+      </w:r>
+    </w:p>
+    <w:p>
+      <w:pPr>
+        <w:spacing w:before="80" w:after="160"/>
+        <w:jc w:val="both"/>
+      </w:pPr>
+      <w:r>
+        <w:rPr>
+          <w:rFonts w:ascii="Arial" w:cs="Arial" w:eastAsia="Arial" w:hAnsi="Arial"/>
+          <w:sz w:val="22"/>
+          <w:szCs w:val="22"/>
+        </w:rPr>
+        <w:t xml:space="preserve">Esta isomorfía tiene una consecuencia práctica importante: cualquier entidad que controle una carpeta controla automáticamente la clave asociada a ella, y puede delegar claves a subcarpetas mediante grant_key. La autoridad sobre una rama del árbol es a la vez autoridad sobre la información publicada en esa rama y autoridad sobre las claves criptográficas que la protegen. No hay posibilidad de que estas dos autoridades divergan. La sección 4.11 formaliza este principio con la clase TrusteandoNode.</w:t>
       </w:r>
     </w:p>
     <w:p>
@@ -3241,7 +3568,7 @@
           <w:sz w:val="22"/>
           <w:szCs w:val="22"/>
         </w:rPr>
-        <w:t xml:space="preserve">El riesgo principal es el ataque Sybil: si un atacante controla la mayoría de las réplicas puede validar relaciones inexistentes. La mitigación es estructural: las réplicas no son nodos anónimos sino entidades con identidad verificable en el propio grafo. Observadores con intereses contrapuestos — universidades de países distintos, organismos de diferentes jurisdicciones — hacen que la colusión sea socialmente improbable además de criptográficamente costosa. La especificación formal de este mecanismo se abordará en versiones futuras.</w:t>
+        <w:t xml:space="preserve">El riesgo principal es el ataque Sybil: si un atacante controla la mayoría de las réplicas puede validar relaciones inexistentes. La mitigación es estructural: las réplicas no son nodos anónimos sino entidades con identidad verificable en el propio grafo. Observadores con intereses contrapuestos — universidades de países distintos, organismos de diferentes jurisdicciones — hacen que la colusión sea socialmente improbable además de criptográficamente costosa. La especificación formal de este mecanismo se abordará en versiones futuras. La operación de verificación de cada réplica es directamente expresable en términos de la clase TrusteandoNode definida en la sección 4.11: verify_child_authorship encapsula exactamente el cálculo que cada réplica ejecuta para validar una credencial.</w:t>
       </w:r>
     </w:p>
     <w:p>
@@ -3336,7 +3663,7 @@
           <w:sz w:val="22"/>
           <w:szCs w:val="22"/>
         </w:rPr>
-        <w:t xml:space="preserve">Esta separación hace la cadena de confianza robusta frente a compromisos internos: incluso si un nivel superior es malicioso o está comprometido, no puede fabricar credenciales atribuibles a sus agentes inferiores.</w:t>
+        <w:t xml:space="preserve">Esta separación hace la cadena de confianza robusta frente a compromisos internos: incluso si un nivel superior es malicioso o está comprometido, no puede fabricar credenciales atribuibles a sus agentes inferiores. La sección 4.11 formaliza este mecanismo en términos del modelo TrusteandoNode: respond_to_challenge garantiza la autoría porque solo el titular de la clave puede producir la respuesta correcta, y verify_child_authorship permite al padre verificar sin que el hijo participe.</w:t>
       </w:r>
     </w:p>
     <w:p>
@@ -4936,6 +5263,604 @@
           <w:szCs w:val="22"/>
         </w:rPr>
         <w:t xml:space="preserve">Esta extensión convierte Trusteando en un sistema policefálico por diseño desde el momento del alta. No hay un único punto de fallo, no hay una única autoridad de la que dependa la existencia de una identidad. La identidad es del sujeto, respaldada por un quórum de testigos independientes que ejecutan un algoritmo público. El resultado es un sistema que hereda la robustez de los sistemas de consenso distribuido sin necesidad de blockchain, porque la prueba de existencia es la multiplicidad de firmas independientes, no una cadena inmutable compartida.</w:t>
+      </w:r>
+    </w:p>
+    <w:p>
+      <w:pPr>
+        <w:pStyle w:val="Heading1"/>
+        <w:spacing w:before="480" w:after="200"/>
+      </w:pPr>
+      <w:r>
+        <w:rPr>
+          <w:rFonts w:ascii="Arial" w:cs="Arial" w:eastAsia="Arial" w:hAnsi="Arial"/>
+          <w:b/>
+          <w:bCs/>
+          <w:color w:val="1A1A2E"/>
+          <w:sz w:val="34"/>
+          <w:szCs w:val="34"/>
+        </w:rPr>
+        <w:t xml:space="preserve">4.11 El núcleo del protocolo: cuatro funciones</w:t>
+      </w:r>
+    </w:p>
+    <w:p>
+      <w:pPr>
+        <w:spacing w:before="80" w:after="160"/>
+        <w:jc w:val="both"/>
+      </w:pPr>
+      <w:r>
+        <w:rPr>
+          <w:rFonts w:ascii="Arial" w:cs="Arial" w:eastAsia="Arial" w:hAnsi="Arial"/>
+          <w:sz w:val="22"/>
+          <w:szCs w:val="22"/>
+        </w:rPr>
+        <w:t xml:space="preserve">Trusteando se construye sobre una premisa tan simple como profunda: cada carpeta del grafo es un nodo, y cada nodo tiene una clave privada que se deriva directamente de su ruta en la jerarquía. No hay infraestructura de clave pública separada. No hay certificados. No hay autoridades externas. La estructura de carpetas es la infraestructura criptográfica. Todo el protocolo se reduce a cuatro funciones que caben en unas pocas líneas de código. Aunque parecen simples, resuelven todos los problemas planteados sin casos especiales ni cabos sueltos.</w:t>
+      </w:r>
+    </w:p>
+    <w:p>
+      <w:pPr>
+        <w:shd w:fill="F0F4F8" w:val="clear"/>
+        <w:spacing w:before="120" w:after="0"/>
+        <w:ind w:left="400" w:right="400"/>
+      </w:pPr>
+    </w:p>
+    <w:p>
+      <w:pPr>
+        <w:shd w:fill="F0F4F8" w:val="clear"/>
+        <w:spacing w:before="0" w:after="0"/>
+        <w:ind w:left="600" w:right="400"/>
+      </w:pPr>
+      <w:r>
+        <w:rPr>
+          <w:rFonts w:ascii="Courier New" w:cs="Courier New" w:eastAsia="Courier New" w:hAnsi="Courier New"/>
+          <w:color w:val="1A3A5C"/>
+          <w:sz w:val="19"/>
+          <w:szCs w:val="19"/>
+        </w:rPr>
+        <w:t xml:space="preserve">class TrusteandoNode:</w:t>
+      </w:r>
+    </w:p>
+    <w:p>
+      <w:pPr>
+        <w:shd w:fill="F0F4F8" w:val="clear"/>
+        <w:spacing w:before="0" w:after="0"/>
+        <w:ind w:left="600" w:right="400"/>
+      </w:pPr>
+      <w:r>
+        <w:rPr>
+          <w:rFonts w:ascii="Courier New" w:cs="Courier New" w:eastAsia="Courier New" w:hAnsi="Courier New"/>
+          <w:color w:val="1A3A5C"/>
+          <w:sz w:val="19"/>
+          <w:szCs w:val="19"/>
+        </w:rPr>
+        <w:t xml:space="preserve">    def __init__(self, key):</w:t>
+      </w:r>
+    </w:p>
+    <w:p>
+      <w:pPr>
+        <w:shd w:fill="F0F4F8" w:val="clear"/>
+        <w:spacing w:before="0" w:after="0"/>
+        <w:ind w:left="600" w:right="400"/>
+      </w:pPr>
+      <w:r>
+        <w:rPr>
+          <w:rFonts w:ascii="Courier New" w:cs="Courier New" w:eastAsia="Courier New" w:hAnsi="Courier New"/>
+          <w:color w:val="1A3A5C"/>
+          <w:sz w:val="19"/>
+          <w:szCs w:val="19"/>
+        </w:rPr>
+        <w:t xml:space="preserve">        self.key = key</w:t>
+      </w:r>
+    </w:p>
+    <w:p>
+      <w:pPr>
+        <w:shd w:fill="F0F4F8" w:val="clear"/>
+        <w:spacing w:before="0" w:after="0"/>
+        <w:ind w:left="600" w:right="400"/>
+      </w:pPr>
+      <w:r>
+        <w:rPr>
+          <w:rFonts w:ascii="Courier New" w:cs="Courier New" w:eastAsia="Courier New" w:hAnsi="Courier New"/>
+          <w:color w:val="1A3A5C"/>
+          <w:sz w:val="19"/>
+          <w:szCs w:val="19"/>
+        </w:rPr>
+        <w:t xml:space="preserve"/>
+      </w:r>
+    </w:p>
+    <w:p>
+      <w:pPr>
+        <w:shd w:fill="F0F4F8" w:val="clear"/>
+        <w:spacing w:before="0" w:after="0"/>
+        <w:ind w:left="600" w:right="400"/>
+      </w:pPr>
+      <w:r>
+        <w:rPr>
+          <w:rFonts w:ascii="Courier New" w:cs="Courier New" w:eastAsia="Courier New" w:hAnsi="Courier New"/>
+          <w:color w:val="1A3A5C"/>
+          <w:sz w:val="19"/>
+          <w:szCs w:val="19"/>
+        </w:rPr>
+        <w:t xml:space="preserve">    @staticmethod</w:t>
+      </w:r>
+    </w:p>
+    <w:p>
+      <w:pPr>
+        <w:shd w:fill="F0F4F8" w:val="clear"/>
+        <w:spacing w:before="0" w:after="0"/>
+        <w:ind w:left="600" w:right="400"/>
+      </w:pPr>
+      <w:r>
+        <w:rPr>
+          <w:rFonts w:ascii="Courier New" w:cs="Courier New" w:eastAsia="Courier New" w:hAnsi="Courier New"/>
+          <w:color w:val="1A3A5C"/>
+          <w:sz w:val="19"/>
+          <w:szCs w:val="19"/>
+        </w:rPr>
+        <w:t xml:space="preserve">    def reduce_hash(seed, elements):</w:t>
+      </w:r>
+    </w:p>
+    <w:p>
+      <w:pPr>
+        <w:shd w:fill="F0F4F8" w:val="clear"/>
+        <w:spacing w:before="0" w:after="0"/>
+        <w:ind w:left="600" w:right="400"/>
+      </w:pPr>
+      <w:r>
+        <w:rPr>
+          <w:rFonts w:ascii="Courier New" w:cs="Courier New" w:eastAsia="Courier New" w:hAnsi="Courier New"/>
+          <w:color w:val="1A3A5C"/>
+          <w:sz w:val="19"/>
+          <w:szCs w:val="19"/>
+        </w:rPr>
+        <w:t xml:space="preserve">        """Operación primitiva: fold hash por la izquierda"""</w:t>
+      </w:r>
+    </w:p>
+    <w:p>
+      <w:pPr>
+        <w:shd w:fill="F0F4F8" w:val="clear"/>
+        <w:spacing w:before="0" w:after="0"/>
+        <w:ind w:left="600" w:right="400"/>
+      </w:pPr>
+      <w:r>
+        <w:rPr>
+          <w:rFonts w:ascii="Courier New" w:cs="Courier New" w:eastAsia="Courier New" w:hAnsi="Courier New"/>
+          <w:color w:val="1A3A5C"/>
+          <w:sz w:val="19"/>
+          <w:szCs w:val="19"/>
+        </w:rPr>
+        <w:t xml:space="preserve">        result = seed</w:t>
+      </w:r>
+    </w:p>
+    <w:p>
+      <w:pPr>
+        <w:shd w:fill="F0F4F8" w:val="clear"/>
+        <w:spacing w:before="0" w:after="0"/>
+        <w:ind w:left="600" w:right="400"/>
+      </w:pPr>
+      <w:r>
+        <w:rPr>
+          <w:rFonts w:ascii="Courier New" w:cs="Courier New" w:eastAsia="Courier New" w:hAnsi="Courier New"/>
+          <w:color w:val="1A3A5C"/>
+          <w:sz w:val="19"/>
+          <w:szCs w:val="19"/>
+        </w:rPr>
+        <w:t xml:space="preserve">        for element in elements:</w:t>
+      </w:r>
+    </w:p>
+    <w:p>
+      <w:pPr>
+        <w:shd w:fill="F0F4F8" w:val="clear"/>
+        <w:spacing w:before="0" w:after="0"/>
+        <w:ind w:left="600" w:right="400"/>
+      </w:pPr>
+      <w:r>
+        <w:rPr>
+          <w:rFonts w:ascii="Courier New" w:cs="Courier New" w:eastAsia="Courier New" w:hAnsi="Courier New"/>
+          <w:color w:val="1A3A5C"/>
+          <w:sz w:val="19"/>
+          <w:szCs w:val="19"/>
+        </w:rPr>
+        <w:t xml:space="preserve">            result = hash(result + element)</w:t>
+      </w:r>
+    </w:p>
+    <w:p>
+      <w:pPr>
+        <w:shd w:fill="F0F4F8" w:val="clear"/>
+        <w:spacing w:before="0" w:after="0"/>
+        <w:ind w:left="600" w:right="400"/>
+      </w:pPr>
+      <w:r>
+        <w:rPr>
+          <w:rFonts w:ascii="Courier New" w:cs="Courier New" w:eastAsia="Courier New" w:hAnsi="Courier New"/>
+          <w:color w:val="1A3A5C"/>
+          <w:sz w:val="19"/>
+          <w:szCs w:val="19"/>
+        </w:rPr>
+        <w:t xml:space="preserve">        return result</w:t>
+      </w:r>
+    </w:p>
+    <w:p>
+      <w:pPr>
+        <w:shd w:fill="F0F4F8" w:val="clear"/>
+        <w:spacing w:before="0" w:after="0"/>
+        <w:ind w:left="600" w:right="400"/>
+      </w:pPr>
+      <w:r>
+        <w:rPr>
+          <w:rFonts w:ascii="Courier New" w:cs="Courier New" w:eastAsia="Courier New" w:hAnsi="Courier New"/>
+          <w:color w:val="1A3A5C"/>
+          <w:sz w:val="19"/>
+          <w:szCs w:val="19"/>
+        </w:rPr>
+        <w:t xml:space="preserve"/>
+      </w:r>
+    </w:p>
+    <w:p>
+      <w:pPr>
+        <w:shd w:fill="F0F4F8" w:val="clear"/>
+        <w:spacing w:before="0" w:after="0"/>
+        <w:ind w:left="600" w:right="400"/>
+      </w:pPr>
+      <w:r>
+        <w:rPr>
+          <w:rFonts w:ascii="Courier New" w:cs="Courier New" w:eastAsia="Courier New" w:hAnsi="Courier New"/>
+          <w:color w:val="1A3A5C"/>
+          <w:sz w:val="19"/>
+          <w:szCs w:val="19"/>
+        </w:rPr>
+        <w:t xml:space="preserve">    def grant_key(self, child_path_segment):</w:t>
+      </w:r>
+    </w:p>
+    <w:p>
+      <w:pPr>
+        <w:shd w:fill="F0F4F8" w:val="clear"/>
+        <w:spacing w:before="0" w:after="0"/>
+        <w:ind w:left="600" w:right="400"/>
+      </w:pPr>
+      <w:r>
+        <w:rPr>
+          <w:rFonts w:ascii="Courier New" w:cs="Courier New" w:eastAsia="Courier New" w:hAnsi="Courier New"/>
+          <w:color w:val="1A3A5C"/>
+          <w:sz w:val="19"/>
+          <w:szCs w:val="19"/>
+        </w:rPr>
+        <w:t xml:space="preserve">        """El padre otorga una clave al hijo"""</w:t>
+      </w:r>
+    </w:p>
+    <w:p>
+      <w:pPr>
+        <w:shd w:fill="F0F4F8" w:val="clear"/>
+        <w:spacing w:before="0" w:after="0"/>
+        <w:ind w:left="600" w:right="400"/>
+      </w:pPr>
+      <w:r>
+        <w:rPr>
+          <w:rFonts w:ascii="Courier New" w:cs="Courier New" w:eastAsia="Courier New" w:hAnsi="Courier New"/>
+          <w:color w:val="1A3A5C"/>
+          <w:sz w:val="19"/>
+          <w:szCs w:val="19"/>
+        </w:rPr>
+        <w:t xml:space="preserve">        return hash(self.key + child_path_segment)</w:t>
+      </w:r>
+    </w:p>
+    <w:p>
+      <w:pPr>
+        <w:shd w:fill="F0F4F8" w:val="clear"/>
+        <w:spacing w:before="0" w:after="0"/>
+        <w:ind w:left="600" w:right="400"/>
+      </w:pPr>
+      <w:r>
+        <w:rPr>
+          <w:rFonts w:ascii="Courier New" w:cs="Courier New" w:eastAsia="Courier New" w:hAnsi="Courier New"/>
+          <w:color w:val="1A3A5C"/>
+          <w:sz w:val="19"/>
+          <w:szCs w:val="19"/>
+        </w:rPr>
+        <w:t xml:space="preserve"/>
+      </w:r>
+    </w:p>
+    <w:p>
+      <w:pPr>
+        <w:shd w:fill="F0F4F8" w:val="clear"/>
+        <w:spacing w:before="0" w:after="0"/>
+        <w:ind w:left="600" w:right="400"/>
+      </w:pPr>
+      <w:r>
+        <w:rPr>
+          <w:rFonts w:ascii="Courier New" w:cs="Courier New" w:eastAsia="Courier New" w:hAnsi="Courier New"/>
+          <w:color w:val="1A3A5C"/>
+          <w:sz w:val="19"/>
+          <w:szCs w:val="19"/>
+        </w:rPr>
+        <w:t xml:space="preserve">    def respond_to_challenge(self, context_elements):</w:t>
+      </w:r>
+    </w:p>
+    <w:p>
+      <w:pPr>
+        <w:shd w:fill="F0F4F8" w:val="clear"/>
+        <w:spacing w:before="0" w:after="0"/>
+        <w:ind w:left="600" w:right="400"/>
+      </w:pPr>
+      <w:r>
+        <w:rPr>
+          <w:rFonts w:ascii="Courier New" w:cs="Courier New" w:eastAsia="Courier New" w:hAnsi="Courier New"/>
+          <w:color w:val="1A3A5C"/>
+          <w:sz w:val="19"/>
+          <w:szCs w:val="19"/>
+        </w:rPr>
+        <w:t xml:space="preserve">        """El hijo responde a un reto sin revelar su clave"""</w:t>
+      </w:r>
+    </w:p>
+    <w:p>
+      <w:pPr>
+        <w:shd w:fill="F0F4F8" w:val="clear"/>
+        <w:spacing w:before="0" w:after="0"/>
+        <w:ind w:left="600" w:right="400"/>
+      </w:pPr>
+      <w:r>
+        <w:rPr>
+          <w:rFonts w:ascii="Courier New" w:cs="Courier New" w:eastAsia="Courier New" w:hAnsi="Courier New"/>
+          <w:color w:val="1A3A5C"/>
+          <w:sz w:val="19"/>
+          <w:szCs w:val="19"/>
+        </w:rPr>
+        <w:t xml:space="preserve">        return self.reduce_hash(self.key, context_elements)</w:t>
+      </w:r>
+    </w:p>
+    <w:p>
+      <w:pPr>
+        <w:shd w:fill="F0F4F8" w:val="clear"/>
+        <w:spacing w:before="0" w:after="0"/>
+        <w:ind w:left="600" w:right="400"/>
+      </w:pPr>
+      <w:r>
+        <w:rPr>
+          <w:rFonts w:ascii="Courier New" w:cs="Courier New" w:eastAsia="Courier New" w:hAnsi="Courier New"/>
+          <w:color w:val="1A3A5C"/>
+          <w:sz w:val="19"/>
+          <w:szCs w:val="19"/>
+        </w:rPr>
+        <w:t xml:space="preserve"/>
+      </w:r>
+    </w:p>
+    <w:p>
+      <w:pPr>
+        <w:shd w:fill="F0F4F8" w:val="clear"/>
+        <w:spacing w:before="0" w:after="0"/>
+        <w:ind w:left="600" w:right="400"/>
+      </w:pPr>
+      <w:r>
+        <w:rPr>
+          <w:rFonts w:ascii="Courier New" w:cs="Courier New" w:eastAsia="Courier New" w:hAnsi="Courier New"/>
+          <w:color w:val="1A3A5C"/>
+          <w:sz w:val="19"/>
+          <w:szCs w:val="19"/>
+        </w:rPr>
+        <w:t xml:space="preserve">    def verify_child_authorship(self, child_path_segment, context_elements, proof):</w:t>
+      </w:r>
+    </w:p>
+    <w:p>
+      <w:pPr>
+        <w:shd w:fill="F0F4F8" w:val="clear"/>
+        <w:spacing w:before="0" w:after="0"/>
+        <w:ind w:left="600" w:right="400"/>
+      </w:pPr>
+      <w:r>
+        <w:rPr>
+          <w:rFonts w:ascii="Courier New" w:cs="Courier New" w:eastAsia="Courier New" w:hAnsi="Courier New"/>
+          <w:color w:val="1A3A5C"/>
+          <w:sz w:val="19"/>
+          <w:szCs w:val="19"/>
+        </w:rPr>
+        <w:t xml:space="preserve">        """Solo el padre puede verificar la autoría de un hijo"""</w:t>
+      </w:r>
+    </w:p>
+    <w:p>
+      <w:pPr>
+        <w:shd w:fill="F0F4F8" w:val="clear"/>
+        <w:spacing w:before="0" w:after="0"/>
+        <w:ind w:left="600" w:right="400"/>
+      </w:pPr>
+      <w:r>
+        <w:rPr>
+          <w:rFonts w:ascii="Courier New" w:cs="Courier New" w:eastAsia="Courier New" w:hAnsi="Courier New"/>
+          <w:color w:val="1A3A5C"/>
+          <w:sz w:val="19"/>
+          <w:szCs w:val="19"/>
+        </w:rPr>
+        <w:t xml:space="preserve">        child_key = self.grant_key(child_path_segment)</w:t>
+      </w:r>
+    </w:p>
+    <w:p>
+      <w:pPr>
+        <w:shd w:fill="F0F4F8" w:val="clear"/>
+        <w:spacing w:before="0" w:after="0"/>
+        <w:ind w:left="600" w:right="400"/>
+      </w:pPr>
+      <w:r>
+        <w:rPr>
+          <w:rFonts w:ascii="Courier New" w:cs="Courier New" w:eastAsia="Courier New" w:hAnsi="Courier New"/>
+          <w:color w:val="1A3A5C"/>
+          <w:sz w:val="19"/>
+          <w:szCs w:val="19"/>
+        </w:rPr>
+        <w:t xml:space="preserve">        return self.reduce_hash(child_key, context_elements) == proof</w:t>
+      </w:r>
+    </w:p>
+    <w:p>
+      <w:pPr>
+        <w:shd w:fill="F0F4F8" w:val="clear"/>
+        <w:spacing w:before="0" w:after="120"/>
+        <w:ind w:left="400" w:right="400"/>
+      </w:pPr>
+    </w:p>
+    <w:p>
+      <w:pPr>
+        <w:pStyle w:val="Heading2"/>
+        <w:spacing w:before="320" w:after="140"/>
+      </w:pPr>
+      <w:r>
+        <w:rPr>
+          <w:rFonts w:ascii="Arial" w:cs="Arial" w:eastAsia="Arial" w:hAnsi="Arial"/>
+          <w:b/>
+          <w:bCs/>
+          <w:color w:val="2C3E7A"/>
+          <w:sz w:val="26"/>
+          <w:szCs w:val="26"/>
+        </w:rPr>
+        <w:t xml:space="preserve">4.11.1 reduce_hash: la operación primitiva</w:t>
+      </w:r>
+    </w:p>
+    <w:p>
+      <w:pPr>
+        <w:spacing w:before="80" w:after="160"/>
+        <w:jc w:val="both"/>
+      </w:pPr>
+      <w:r>
+        <w:rPr>
+          <w:rFonts w:ascii="Arial" w:cs="Arial" w:eastAsia="Arial" w:hAnsi="Arial"/>
+          <w:sz w:val="22"/>
+          <w:szCs w:val="22"/>
+        </w:rPr>
+        <w:t xml:space="preserve">reduce_hash es la única operación criptográfica que necesita el protocolo. Toma una semilla y una lista de elementos y devuelve un hash que depende de todos ellos en orden. Es determinista (mismos inputs producen mismo output), unidireccional (el output no permite recuperar ningún input), sensible al orden (reduce_hash(s, [a,b]) es distinto de reduce_hash(s, [b,a])), y composable (se puede verificar por etapas).</w:t>
+      </w:r>
+    </w:p>
+    <w:p>
+      <w:pPr>
+        <w:pStyle w:val="Heading2"/>
+        <w:spacing w:before="320" w:after="140"/>
+      </w:pPr>
+      <w:r>
+        <w:rPr>
+          <w:rFonts w:ascii="Arial" w:cs="Arial" w:eastAsia="Arial" w:hAnsi="Arial"/>
+          <w:b/>
+          <w:bCs/>
+          <w:color w:val="2C3E7A"/>
+          <w:sz w:val="26"/>
+          <w:szCs w:val="26"/>
+        </w:rPr>
+        <w:t xml:space="preserve">4.11.2 grant_key: el padre otorga claves al hijo</w:t>
+      </w:r>
+    </w:p>
+    <w:p>
+      <w:pPr>
+        <w:spacing w:before="80" w:after="160"/>
+        <w:jc w:val="both"/>
+      </w:pPr>
+      <w:r>
+        <w:rPr>
+          <w:rFonts w:ascii="Arial" w:cs="Arial" w:eastAsia="Arial" w:hAnsi="Arial"/>
+          <w:sz w:val="22"/>
+          <w:szCs w:val="22"/>
+        </w:rPr>
+        <w:t xml:space="preserve">Cuando un nodo padre incorpora un hijo con un segmento de ruta, le otorga una clave derivada: child_key = hash(parent_key + child_path_segment). El padre entrega child_key al hijo por un canal seguro. A partir de ese momento el hijo conoce su clave, el padre puede recalcularla cuando sea necesario, y nadie más la conoce. El hijo nunca conoce la clave del padre — la dirección de confianza es estrictamente descendente.</w:t>
+      </w:r>
+    </w:p>
+    <w:p>
+      <w:pPr>
+        <w:pStyle w:val="Heading2"/>
+        <w:spacing w:before="320" w:after="140"/>
+      </w:pPr>
+      <w:r>
+        <w:rPr>
+          <w:rFonts w:ascii="Arial" w:cs="Arial" w:eastAsia="Arial" w:hAnsi="Arial"/>
+          <w:b/>
+          <w:bCs/>
+          <w:color w:val="2C3E7A"/>
+          <w:sz w:val="26"/>
+          <w:szCs w:val="26"/>
+        </w:rPr>
+        <w:t xml:space="preserve">4.11.3 respond_to_challenge: el hijo responde sin revelar su clave</w:t>
+      </w:r>
+    </w:p>
+    <w:p>
+      <w:pPr>
+        <w:spacing w:before="80" w:after="160"/>
+        <w:jc w:val="both"/>
+      </w:pPr>
+      <w:r>
+        <w:rPr>
+          <w:rFonts w:ascii="Arial" w:cs="Arial" w:eastAsia="Arial" w:hAnsi="Arial"/>
+          <w:sz w:val="22"/>
+          <w:szCs w:val="22"/>
+        </w:rPr>
+        <w:t xml:space="preserve">Cuando un nodo quiere probar su identidad para un contexto específico, genera una prueba: prueba = reduce_hash(self.key, [verificador_id, hash(contenido), timestamp]). El nodo no revela su clave, solo demuestra que la conoce. La prueba es específica para ese verificador, ese contenido y ese momento — no puede reutilizarse ni transferirse.</w:t>
+      </w:r>
+    </w:p>
+    <w:p>
+      <w:pPr>
+        <w:spacing w:before="80" w:after="160"/>
+        <w:jc w:val="both"/>
+      </w:pPr>
+      <w:r>
+        <w:rPr>
+          <w:rFonts w:ascii="Arial" w:cs="Arial" w:eastAsia="Arial" w:hAnsi="Arial"/>
+          <w:sz w:val="22"/>
+          <w:szCs w:val="22"/>
+        </w:rPr>
+        <w:t xml:space="preserve">Ejemplo: un profesor publica un comentario en un foro externo con su profesor_id. El moderador quiere verificar que es realmente ese profesor. El moderador envía al profesor: [moderador_id, hash(comentario), timestamp]. El profesor calcula respond_to_challenge([moderador_id, hash(comentario), timestamp]) y envía la respuesta. El moderador la envía al nodo padre — el que aparece en la ruta del profesor_id — junto con el contexto. El padre verifica.</w:t>
+      </w:r>
+    </w:p>
+    <w:p>
+      <w:pPr>
+        <w:pStyle w:val="Heading2"/>
+        <w:spacing w:before="320" w:after="140"/>
+      </w:pPr>
+      <w:r>
+        <w:rPr>
+          <w:rFonts w:ascii="Arial" w:cs="Arial" w:eastAsia="Arial" w:hAnsi="Arial"/>
+          <w:b/>
+          <w:bCs/>
+          <w:color w:val="2C3E7A"/>
+          <w:sz w:val="26"/>
+          <w:szCs w:val="26"/>
+        </w:rPr>
+        <w:t xml:space="preserve">4.11.4 verify_child_authorship: solo el padre verifica</w:t>
+      </w:r>
+    </w:p>
+    <w:p>
+      <w:pPr>
+        <w:spacing w:before="80" w:after="160"/>
+        <w:jc w:val="both"/>
+      </w:pPr>
+      <w:r>
+        <w:rPr>
+          <w:rFonts w:ascii="Arial" w:cs="Arial" w:eastAsia="Arial" w:hAnsi="Arial"/>
+          <w:sz w:val="22"/>
+          <w:szCs w:val="22"/>
+        </w:rPr>
+        <w:t xml:space="preserve">El verificador externo no elige a quién preguntar arbitrariamente — pregunta siempre al nodo padre del hijo que emitió la prueba. Si el identificador es uma.es/profesores/juan, la solicitud de verificación va a uma.es/profesores. El padre recalcula la clave del hijo con grant_key y verifica la prueba con reduce_hash. Si coinciden, la prueba es auténtica. El hijo no participa en la verificación.</w:t>
+      </w:r>
+    </w:p>
+    <w:p>
+      <w:pPr>
+        <w:pStyle w:val="Heading2"/>
+        <w:spacing w:before="320" w:after="140"/>
+      </w:pPr>
+      <w:r>
+        <w:rPr>
+          <w:rFonts w:ascii="Arial" w:cs="Arial" w:eastAsia="Arial" w:hAnsi="Arial"/>
+          <w:b/>
+          <w:bCs/>
+          <w:color w:val="2C3E7A"/>
+          <w:sz w:val="26"/>
+          <w:szCs w:val="26"/>
+        </w:rPr>
+        <w:t xml:space="preserve">4.11.5 Propiedades de seguridad que emergen de la simplicidad</w:t>
+      </w:r>
+    </w:p>
+    <w:p>
+      <w:pPr>
+        <w:spacing w:before="80" w:after="160"/>
+        <w:jc w:val="both"/>
+      </w:pPr>
+      <w:r>
+        <w:rPr>
+          <w:rFonts w:ascii="Arial" w:cs="Arial" w:eastAsia="Arial" w:hAnsi="Arial"/>
+          <w:sz w:val="22"/>
+          <w:szCs w:val="22"/>
+        </w:rPr>
+        <w:t xml:space="preserve">No repudio: solo quien tiene la clave puede producir respond_to_challenge correcto. No reutilizable: context_elements incluye verificador_id y timestamp, únicos por interacción. No transferible: la respuesta solo es válida para ese conjunto específico de elementos. Sin revelación de clave: reduce_hash es unidireccional; la respuesta no permite recuperar la clave. Verificación por el padre: verify_child_authorship recalcula sin necesitar al hijo. Jerarquía de confianza: grant_key es la única forma de crear un nodo hijo válido, siempre de padre a hijo. Verificación externa: cualquier sistema — foros, correo, documentos — puede usar el mismo mecanismo enviando un reto y verificando la respuesta con el padre. No hay casos especiales. No hay estado oculto. Todo el sistema es determinínista, auditable y verificable por construcción.</w:t>
       </w:r>
     </w:p>
     <w:p>
@@ -6283,6 +7208,752 @@
     </w:p>
     <w:p>
       <w:pPr>
+        <w:pStyle w:val="Heading2"/>
+        <w:spacing w:before="320" w:after="140"/>
+      </w:pPr>
+      <w:r>
+        <w:rPr>
+          <w:rFonts w:ascii="Arial" w:cs="Arial" w:eastAsia="Arial" w:hAnsi="Arial"/>
+          <w:b/>
+          <w:bCs/>
+          <w:color w:val="2C3E7A"/>
+          <w:sz w:val="26"/>
+          <w:szCs w:val="26"/>
+        </w:rPr>
+        <w:t xml:space="preserve">7.10 Bootstrapping de identidad mediante control de canal externo</w:t>
+      </w:r>
+    </w:p>
+    <w:p>
+      <w:pPr>
+        <w:spacing w:before="80" w:after="160"/>
+        <w:jc w:val="both"/>
+      </w:pPr>
+      <w:r>
+        <w:rPr>
+          <w:rFonts w:ascii="Arial" w:cs="Arial" w:eastAsia="Arial" w:hAnsi="Arial"/>
+          <w:sz w:val="22"/>
+          <w:szCs w:val="22"/>
+        </w:rPr>
+        <w:t xml:space="preserve">El protocolo requiere habitualmente que un nodo padre otorgue una clave a un hijo mediante grant_key. Pero hay entidades que ya tienen presencia verificable en plataformas externas — Hacker News, GitHub, Twitter — sin tener un dominio propio. El mecanismo de bootstrapping mediante canal externo permite incorporar esas identidades al protocolo sin romper la jerarquía de confianza.</w:t>
+      </w:r>
+    </w:p>
+    <w:p>
+      <w:pPr>
+        <w:spacing w:before="80" w:after="160"/>
+        <w:jc w:val="both"/>
+      </w:pPr>
+      <w:r>
+        <w:rPr>
+          <w:rFonts w:ascii="Arial" w:cs="Arial" w:eastAsia="Arial" w:hAnsi="Arial"/>
+          <w:sz w:val="22"/>
+          <w:szCs w:val="22"/>
+        </w:rPr>
+        <w:t xml:space="preserve">El flujo es el siguiente. El usuario solicita al nodo plataforma — por ejemplo trusteando/hn/ — unirse al sistema. El nodo genera un par de claves derivadas del identificador del usuario:</w:t>
+      </w:r>
+    </w:p>
+    <w:p>
+      <w:pPr>
+        <w:shd w:fill="F0F4F8" w:val="clear"/>
+        <w:spacing w:before="120" w:after="0"/>
+        <w:ind w:left="400" w:right="400"/>
+      </w:pPr>
+    </w:p>
+    <w:p>
+      <w:pPr>
+        <w:shd w:fill="F0F4F8" w:val="clear"/>
+        <w:spacing w:before="0" w:after="0"/>
+        <w:ind w:left="600" w:right="400"/>
+      </w:pPr>
+      <w:r>
+        <w:rPr>
+          <w:rFonts w:ascii="Courier New" w:cs="Courier New" w:eastAsia="Courier New" w:hAnsi="Courier New"/>
+          <w:color w:val="1A3A5C"/>
+          <w:sz w:val="19"/>
+          <w:szCs w:val="19"/>
+        </w:rPr>
+        <w:t xml:space="preserve">verification_key = node.grant_key(user_id + "verify")</w:t>
+      </w:r>
+    </w:p>
+    <w:p>
+      <w:pPr>
+        <w:shd w:fill="F0F4F8" w:val="clear"/>
+        <w:spacing w:before="0" w:after="0"/>
+        <w:ind w:left="600" w:right="400"/>
+      </w:pPr>
+      <w:r>
+        <w:rPr>
+          <w:rFonts w:ascii="Courier New" w:cs="Courier New" w:eastAsia="Courier New" w:hAnsi="Courier New"/>
+          <w:color w:val="1A3A5C"/>
+          <w:sz w:val="19"/>
+          <w:szCs w:val="19"/>
+        </w:rPr>
+        <w:t xml:space="preserve">private_key      = node.grant_key(user_id + "private")</w:t>
+      </w:r>
+    </w:p>
+    <w:p>
+      <w:pPr>
+        <w:shd w:fill="F0F4F8" w:val="clear"/>
+        <w:spacing w:before="0" w:after="120"/>
+        <w:ind w:left="400" w:right="400"/>
+      </w:pPr>
+    </w:p>
+    <w:p>
+      <w:pPr>
+        <w:spacing w:before="80" w:after="160"/>
+        <w:jc w:val="both"/>
+      </w:pPr>
+      <w:r>
+        <w:rPr>
+          <w:rFonts w:ascii="Arial" w:cs="Arial" w:eastAsia="Arial" w:hAnsi="Arial"/>
+          <w:sz w:val="22"/>
+          <w:szCs w:val="22"/>
+        </w:rPr>
+        <w:t xml:space="preserve">El nodo envía verification_key al usuario. El usuario la publica en su perfil público de la plataforma — el campo about de HN, la bio de GitHub, la descripción de Twitter. El nodo consulta ese perfil, verifica que verification_key está ahí, y confirma la identidad. Solo quien controla el perfil puede publicar en él — esa es la prueba. A partir de ese momento el usuario puede responder retos con private_key mediante respond_to_challenge, y el nodo puede verificar con verify_child_authorship sin necesidad de almacenar nada — rederiva private_key en cada verificación a partir de user_id y su propio secreto.</w:t>
+      </w:r>
+    </w:p>
+    <w:p>
+      <w:pPr>
+        <w:spacing w:before="80" w:after="160"/>
+        <w:jc w:val="both"/>
+      </w:pPr>
+      <w:r>
+        <w:rPr>
+          <w:rFonts w:ascii="Arial" w:cs="Arial" w:eastAsia="Arial" w:hAnsi="Arial"/>
+          <w:sz w:val="22"/>
+          <w:szCs w:val="22"/>
+        </w:rPr>
+        <w:t xml:space="preserve">La estructura del nodo plataforma en el grafo es la red paralela hecha visible: cada usuario verificado es un nodo hijo con su propia entrada, su fecha de incorporación, y su estado. El nodo no pertenece a Hacker News ni a ninguna plataforma — es un nodo independiente del protocolo que usa HN como mecanismo de verificación inicial.</w:t>
+      </w:r>
+    </w:p>
+    <w:p>
+      <w:pPr>
+        <w:shd w:fill="F0F4F8" w:val="clear"/>
+        <w:spacing w:before="120" w:after="0"/>
+        <w:ind w:left="400" w:right="400"/>
+      </w:pPr>
+    </w:p>
+    <w:p>
+      <w:pPr>
+        <w:shd w:fill="F0F4F8" w:val="clear"/>
+        <w:spacing w:before="0" w:after="0"/>
+        <w:ind w:left="600" w:right="400"/>
+      </w:pPr>
+      <w:r>
+        <w:rPr>
+          <w:rFonts w:ascii="Courier New" w:cs="Courier New" w:eastAsia="Courier New" w:hAnsi="Courier New"/>
+          <w:color w:val="1A3A5C"/>
+          <w:sz w:val="19"/>
+          <w:szCs w:val="19"/>
+        </w:rPr>
+        <w:t xml:space="preserve">trusteando/hn/</w:t>
+      </w:r>
+    </w:p>
+    <w:p>
+      <w:pPr>
+        <w:shd w:fill="F0F4F8" w:val="clear"/>
+        <w:spacing w:before="0" w:after="0"/>
+        <w:ind w:left="600" w:right="400"/>
+      </w:pPr>
+      <w:r>
+        <w:rPr>
+          <w:rFonts w:ascii="Courier New" w:cs="Courier New" w:eastAsia="Courier New" w:hAnsi="Courier New"/>
+          <w:color w:val="1A3A5C"/>
+          <w:sz w:val="19"/>
+          <w:szCs w:val="19"/>
+        </w:rPr>
+        <w:t xml:space="preserve">├── [source news.ycombinator.com]/</w:t>
+      </w:r>
+    </w:p>
+    <w:p>
+      <w:pPr>
+        <w:shd w:fill="F0F4F8" w:val="clear"/>
+        <w:spacing w:before="0" w:after="0"/>
+        <w:ind w:left="600" w:right="400"/>
+      </w:pPr>
+      <w:r>
+        <w:rPr>
+          <w:rFonts w:ascii="Courier New" w:cs="Courier New" w:eastAsia="Courier New" w:hAnsi="Courier New"/>
+          <w:color w:val="1A3A5C"/>
+          <w:sz w:val="19"/>
+          <w:szCs w:val="19"/>
+        </w:rPr>
+        <w:t xml:space="preserve">├── [quorum 1]/</w:t>
+      </w:r>
+    </w:p>
+    <w:p>
+      <w:pPr>
+        <w:shd w:fill="F0F4F8" w:val="clear"/>
+        <w:spacing w:before="0" w:after="0"/>
+        <w:ind w:left="600" w:right="400"/>
+      </w:pPr>
+      <w:r>
+        <w:rPr>
+          <w:rFonts w:ascii="Courier New" w:cs="Courier New" w:eastAsia="Courier New" w:hAnsi="Courier New"/>
+          <w:color w:val="1A3A5C"/>
+          <w:sz w:val="19"/>
+          <w:szCs w:val="19"/>
+        </w:rPr>
+        <w:t xml:space="preserve">└── registry/</w:t>
+      </w:r>
+    </w:p>
+    <w:p>
+      <w:pPr>
+        <w:shd w:fill="F0F4F8" w:val="clear"/>
+        <w:spacing w:before="0" w:after="0"/>
+        <w:ind w:left="600" w:right="400"/>
+      </w:pPr>
+      <w:r>
+        <w:rPr>
+          <w:rFonts w:ascii="Courier New" w:cs="Courier New" w:eastAsia="Courier New" w:hAnsi="Courier New"/>
+          <w:color w:val="1A3A5C"/>
+          <w:sz w:val="19"/>
+          <w:szCs w:val="19"/>
+        </w:rPr>
+        <w:t xml:space="preserve">    ├── [dang is-member]/</w:t>
+      </w:r>
+    </w:p>
+    <w:p>
+      <w:pPr>
+        <w:shd w:fill="F0F4F8" w:val="clear"/>
+        <w:spacing w:before="0" w:after="0"/>
+        <w:ind w:left="600" w:right="400"/>
+      </w:pPr>
+      <w:r>
+        <w:rPr>
+          <w:rFonts w:ascii="Courier New" w:cs="Courier New" w:eastAsia="Courier New" w:hAnsi="Courier New"/>
+          <w:color w:val="1A3A5C"/>
+          <w:sz w:val="19"/>
+          <w:szCs w:val="19"/>
+        </w:rPr>
+        <w:t xml:space="preserve">    │   ├── since/2026-03-19/</w:t>
+      </w:r>
+    </w:p>
+    <w:p>
+      <w:pPr>
+        <w:shd w:fill="F0F4F8" w:val="clear"/>
+        <w:spacing w:before="0" w:after="0"/>
+        <w:ind w:left="600" w:right="400"/>
+      </w:pPr>
+      <w:r>
+        <w:rPr>
+          <w:rFonts w:ascii="Courier New" w:cs="Courier New" w:eastAsia="Courier New" w:hAnsi="Courier New"/>
+          <w:color w:val="1A3A5C"/>
+          <w:sz w:val="19"/>
+          <w:szCs w:val="19"/>
+        </w:rPr>
+        <w:t xml:space="preserve">    │   └── [state trusteando]/</w:t>
+      </w:r>
+    </w:p>
+    <w:p>
+      <w:pPr>
+        <w:shd w:fill="F0F4F8" w:val="clear"/>
+        <w:spacing w:before="0" w:after="0"/>
+        <w:ind w:left="600" w:right="400"/>
+      </w:pPr>
+      <w:r>
+        <w:rPr>
+          <w:rFonts w:ascii="Courier New" w:cs="Courier New" w:eastAsia="Courier New" w:hAnsi="Courier New"/>
+          <w:color w:val="1A3A5C"/>
+          <w:sz w:val="19"/>
+          <w:szCs w:val="19"/>
+        </w:rPr>
+        <w:t xml:space="preserve">    ├── [pg is-member]/</w:t>
+      </w:r>
+    </w:p>
+    <w:p>
+      <w:pPr>
+        <w:shd w:fill="F0F4F8" w:val="clear"/>
+        <w:spacing w:before="0" w:after="0"/>
+        <w:ind w:left="600" w:right="400"/>
+      </w:pPr>
+      <w:r>
+        <w:rPr>
+          <w:rFonts w:ascii="Courier New" w:cs="Courier New" w:eastAsia="Courier New" w:hAnsi="Courier New"/>
+          <w:color w:val="1A3A5C"/>
+          <w:sz w:val="19"/>
+          <w:szCs w:val="19"/>
+        </w:rPr>
+        <w:t xml:space="preserve">    │   ├── since/2026-03-19/</w:t>
+      </w:r>
+    </w:p>
+    <w:p>
+      <w:pPr>
+        <w:shd w:fill="F0F4F8" w:val="clear"/>
+        <w:spacing w:before="0" w:after="0"/>
+        <w:ind w:left="600" w:right="400"/>
+      </w:pPr>
+      <w:r>
+        <w:rPr>
+          <w:rFonts w:ascii="Courier New" w:cs="Courier New" w:eastAsia="Courier New" w:hAnsi="Courier New"/>
+          <w:color w:val="1A3A5C"/>
+          <w:sz w:val="19"/>
+          <w:szCs w:val="19"/>
+        </w:rPr>
+        <w:t xml:space="preserve">    │   └── [state trusteando]/</w:t>
+      </w:r>
+    </w:p>
+    <w:p>
+      <w:pPr>
+        <w:shd w:fill="F0F4F8" w:val="clear"/>
+        <w:spacing w:before="0" w:after="0"/>
+        <w:ind w:left="600" w:right="400"/>
+      </w:pPr>
+      <w:r>
+        <w:rPr>
+          <w:rFonts w:ascii="Courier New" w:cs="Courier New" w:eastAsia="Courier New" w:hAnsi="Courier New"/>
+          <w:color w:val="1A3A5C"/>
+          <w:sz w:val="19"/>
+          <w:szCs w:val="19"/>
+        </w:rPr>
+        <w:t xml:space="preserve">    └── [confidencenode0 is-member]/</w:t>
+      </w:r>
+    </w:p>
+    <w:p>
+      <w:pPr>
+        <w:shd w:fill="F0F4F8" w:val="clear"/>
+        <w:spacing w:before="0" w:after="0"/>
+        <w:ind w:left="600" w:right="400"/>
+      </w:pPr>
+      <w:r>
+        <w:rPr>
+          <w:rFonts w:ascii="Courier New" w:cs="Courier New" w:eastAsia="Courier New" w:hAnsi="Courier New"/>
+          <w:color w:val="1A3A5C"/>
+          <w:sz w:val="19"/>
+          <w:szCs w:val="19"/>
+        </w:rPr>
+        <w:t xml:space="preserve">        ├── since/2026-03-19/</w:t>
+      </w:r>
+    </w:p>
+    <w:p>
+      <w:pPr>
+        <w:shd w:fill="F0F4F8" w:val="clear"/>
+        <w:spacing w:before="0" w:after="0"/>
+        <w:ind w:left="600" w:right="400"/>
+      </w:pPr>
+      <w:r>
+        <w:rPr>
+          <w:rFonts w:ascii="Courier New" w:cs="Courier New" w:eastAsia="Courier New" w:hAnsi="Courier New"/>
+          <w:color w:val="1A3A5C"/>
+          <w:sz w:val="19"/>
+          <w:szCs w:val="19"/>
+        </w:rPr>
+        <w:t xml:space="preserve">        └── [state trusteando]/</w:t>
+      </w:r>
+    </w:p>
+    <w:p>
+      <w:pPr>
+        <w:shd w:fill="F0F4F8" w:val="clear"/>
+        <w:spacing w:before="0" w:after="120"/>
+        <w:ind w:left="400" w:right="400"/>
+      </w:pPr>
+    </w:p>
+    <w:p>
+      <w:pPr>
+        <w:spacing w:before="80" w:after="160"/>
+        <w:jc w:val="both"/>
+      </w:pPr>
+      <w:r>
+        <w:rPr>
+          <w:rFonts w:ascii="Arial" w:cs="Arial" w:eastAsia="Arial" w:hAnsi="Arial"/>
+          <w:sz w:val="22"/>
+          <w:szCs w:val="22"/>
+        </w:rPr>
+        <w:t xml:space="preserve">El mismo mecanismo es aplicable a cualquier plataforma con perfiles públicos y un campo editable: trusteando/github/, trusteando/twitter/, trusteando/linkedin/. Cada plataforma existente puede tener su nodo espejo verificable. Los usuarios que ya tienen presencia en esas plataformas tienen un camino de entrada al protocolo sin necesitar dominio propio. Y pueden vincular sus identidades de diferentes plataformas bajo una identidad autónoma única usando old_identities/. La red paralela no empieza desde cero — se superpone a las identidades que ya existen en la web.</w:t>
+      </w:r>
+    </w:p>
+    <w:p>
+      <w:pPr>
+        <w:pStyle w:val="Heading2"/>
+        <w:spacing w:before="320" w:after="140"/>
+      </w:pPr>
+      <w:r>
+        <w:rPr>
+          <w:rFonts w:ascii="Arial" w:cs="Arial" w:eastAsia="Arial" w:hAnsi="Arial"/>
+          <w:b/>
+          <w:bCs/>
+          <w:color w:val="2C3E7A"/>
+          <w:sz w:val="26"/>
+          <w:szCs w:val="26"/>
+        </w:rPr>
+        <w:t xml:space="preserve">7.10.1 Jerarquía natural expresada en código</w:t>
+      </w:r>
+    </w:p>
+    <w:p>
+      <w:pPr>
+        <w:spacing w:before="80" w:after="160"/>
+        <w:jc w:val="both"/>
+      </w:pPr>
+      <w:r>
+        <w:rPr>
+          <w:rFonts w:ascii="Arial" w:cs="Arial" w:eastAsia="Arial" w:hAnsi="Arial"/>
+          <w:sz w:val="22"/>
+          <w:szCs w:val="22"/>
+        </w:rPr>
+        <w:t xml:space="preserve">La relación padre-hijo entre el nodo plataforma y sus usuarios es directamente expresable con la clase TrusteandoNode. Los sufijos :verify y :private garantizan que las dos claves derivadas son independientes — conocer una no revela nada sobre la otra:</w:t>
+      </w:r>
+    </w:p>
+    <w:p>
+      <w:pPr>
+        <w:shd w:fill="F0F4F8" w:val="clear"/>
+        <w:spacing w:before="120" w:after="0"/>
+        <w:ind w:left="400" w:right="400"/>
+      </w:pPr>
+    </w:p>
+    <w:p>
+      <w:pPr>
+        <w:shd w:fill="F0F4F8" w:val="clear"/>
+        <w:spacing w:before="0" w:after="0"/>
+        <w:ind w:left="600" w:right="400"/>
+      </w:pPr>
+      <w:r>
+        <w:rPr>
+          <w:rFonts w:ascii="Courier New" w:cs="Courier New" w:eastAsia="Courier New" w:hAnsi="Courier New"/>
+          <w:color w:val="1A3A5C"/>
+          <w:sz w:val="19"/>
+          <w:szCs w:val="19"/>
+        </w:rPr>
+        <w:t xml:space="preserve">hn_node = TrusteandoNode(key_hn)</w:t>
+      </w:r>
+    </w:p>
+    <w:p>
+      <w:pPr>
+        <w:shd w:fill="F0F4F8" w:val="clear"/>
+        <w:spacing w:before="0" w:after="0"/>
+        <w:ind w:left="600" w:right="400"/>
+      </w:pPr>
+      <w:r>
+        <w:rPr>
+          <w:rFonts w:ascii="Courier New" w:cs="Courier New" w:eastAsia="Courier New" w:hAnsi="Courier New"/>
+          <w:color w:val="1A3A5C"/>
+          <w:sz w:val="19"/>
+          <w:szCs w:val="19"/>
+        </w:rPr>
+        <w:t xml:space="preserve"/>
+      </w:r>
+    </w:p>
+    <w:p>
+      <w:pPr>
+        <w:shd w:fill="F0F4F8" w:val="clear"/>
+        <w:spacing w:before="0" w:after="0"/>
+        <w:ind w:left="600" w:right="400"/>
+      </w:pPr>
+      <w:r>
+        <w:rPr>
+          <w:rFonts w:ascii="Courier New" w:cs="Courier New" w:eastAsia="Courier New" w:hAnsi="Courier New"/>
+          <w:color w:val="1A3A5C"/>
+          <w:sz w:val="19"/>
+          <w:szCs w:val="19"/>
+        </w:rPr>
+        <w:t xml:space="preserve"># El nodo deriva el par para cada usuario</w:t>
+      </w:r>
+    </w:p>
+    <w:p>
+      <w:pPr>
+        <w:shd w:fill="F0F4F8" w:val="clear"/>
+        <w:spacing w:before="0" w:after="0"/>
+        <w:ind w:left="600" w:right="400"/>
+      </w:pPr>
+      <w:r>
+        <w:rPr>
+          <w:rFonts w:ascii="Courier New" w:cs="Courier New" w:eastAsia="Courier New" w:hAnsi="Courier New"/>
+          <w:color w:val="1A3A5C"/>
+          <w:sz w:val="19"/>
+          <w:szCs w:val="19"/>
+        </w:rPr>
+        <w:t xml:space="preserve">verification_key = hn_node.grant_key("dang:verify")   ← pública, se publica en el perfil</w:t>
+      </w:r>
+    </w:p>
+    <w:p>
+      <w:pPr>
+        <w:shd w:fill="F0F4F8" w:val="clear"/>
+        <w:spacing w:before="0" w:after="0"/>
+        <w:ind w:left="600" w:right="400"/>
+      </w:pPr>
+      <w:r>
+        <w:rPr>
+          <w:rFonts w:ascii="Courier New" w:cs="Courier New" w:eastAsia="Courier New" w:hAnsi="Courier New"/>
+          <w:color w:val="1A3A5C"/>
+          <w:sz w:val="19"/>
+          <w:szCs w:val="19"/>
+        </w:rPr>
+        <w:t xml:space="preserve">private_key      = hn_node.grant_key("dang:private")  ← privada, la usa el usuario</w:t>
+      </w:r>
+    </w:p>
+    <w:p>
+      <w:pPr>
+        <w:shd w:fill="F0F4F8" w:val="clear"/>
+        <w:spacing w:before="0" w:after="0"/>
+        <w:ind w:left="600" w:right="400"/>
+      </w:pPr>
+      <w:r>
+        <w:rPr>
+          <w:rFonts w:ascii="Courier New" w:cs="Courier New" w:eastAsia="Courier New" w:hAnsi="Courier New"/>
+          <w:color w:val="1A3A5C"/>
+          <w:sz w:val="19"/>
+          <w:szCs w:val="19"/>
+        </w:rPr>
+        <w:t xml:space="preserve"/>
+      </w:r>
+    </w:p>
+    <w:p>
+      <w:pPr>
+        <w:shd w:fill="F0F4F8" w:val="clear"/>
+        <w:spacing w:before="0" w:after="0"/>
+        <w:ind w:left="600" w:right="400"/>
+      </w:pPr>
+      <w:r>
+        <w:rPr>
+          <w:rFonts w:ascii="Courier New" w:cs="Courier New" w:eastAsia="Courier New" w:hAnsi="Courier New"/>
+          <w:color w:val="1A3A5C"/>
+          <w:sz w:val="19"/>
+          <w:szCs w:val="19"/>
+        </w:rPr>
+        <w:t xml:space="preserve"># El nodo verifica cualquier acción del usuario sin almacenar nada:</w:t>
+      </w:r>
+    </w:p>
+    <w:p>
+      <w:pPr>
+        <w:shd w:fill="F0F4F8" w:val="clear"/>
+        <w:spacing w:before="0" w:after="0"/>
+        <w:ind w:left="600" w:right="400"/>
+      </w:pPr>
+      <w:r>
+        <w:rPr>
+          <w:rFonts w:ascii="Courier New" w:cs="Courier New" w:eastAsia="Courier New" w:hAnsi="Courier New"/>
+          <w:color w:val="1A3A5C"/>
+          <w:sz w:val="19"/>
+          <w:szCs w:val="19"/>
+        </w:rPr>
+        <w:t xml:space="preserve">def verify_user_action(user_hn, context, proof):</w:t>
+      </w:r>
+    </w:p>
+    <w:p>
+      <w:pPr>
+        <w:shd w:fill="F0F4F8" w:val="clear"/>
+        <w:spacing w:before="0" w:after="0"/>
+        <w:ind w:left="600" w:right="400"/>
+      </w:pPr>
+      <w:r>
+        <w:rPr>
+          <w:rFonts w:ascii="Courier New" w:cs="Courier New" w:eastAsia="Courier New" w:hAnsi="Courier New"/>
+          <w:color w:val="1A3A5C"/>
+          <w:sz w:val="19"/>
+          <w:szCs w:val="19"/>
+        </w:rPr>
+        <w:t xml:space="preserve">    child_key = hn_node.grant_key(user_hn + ":private")</w:t>
+      </w:r>
+    </w:p>
+    <w:p>
+      <w:pPr>
+        <w:shd w:fill="F0F4F8" w:val="clear"/>
+        <w:spacing w:before="0" w:after="0"/>
+        <w:ind w:left="600" w:right="400"/>
+      </w:pPr>
+      <w:r>
+        <w:rPr>
+          <w:rFonts w:ascii="Courier New" w:cs="Courier New" w:eastAsia="Courier New" w:hAnsi="Courier New"/>
+          <w:color w:val="1A3A5C"/>
+          <w:sz w:val="19"/>
+          <w:szCs w:val="19"/>
+        </w:rPr>
+        <w:t xml:space="preserve">    return hn_node.reduce_hash(child_key, context) == proof</w:t>
+      </w:r>
+    </w:p>
+    <w:p>
+      <w:pPr>
+        <w:shd w:fill="F0F4F8" w:val="clear"/>
+        <w:spacing w:before="0" w:after="120"/>
+        <w:ind w:left="400" w:right="400"/>
+      </w:pPr>
+    </w:p>
+    <w:p>
+      <w:pPr>
+        <w:pStyle w:val="Heading2"/>
+        <w:spacing w:before="320" w:after="140"/>
+      </w:pPr>
+      <w:r>
+        <w:rPr>
+          <w:rFonts w:ascii="Arial" w:cs="Arial" w:eastAsia="Arial" w:hAnsi="Arial"/>
+          <w:b/>
+          <w:bCs/>
+          <w:color w:val="2C3E7A"/>
+          <w:sz w:val="26"/>
+          <w:szCs w:val="26"/>
+        </w:rPr>
+        <w:t xml:space="preserve">7.10.2 El camino desde el bootstrapping a la identidad autónoma</w:t>
+      </w:r>
+    </w:p>
+    <w:p>
+      <w:pPr>
+        <w:spacing w:before="80" w:after="160"/>
+        <w:jc w:val="both"/>
+      </w:pPr>
+      <w:r>
+        <w:rPr>
+          <w:rFonts w:ascii="Arial" w:cs="Arial" w:eastAsia="Arial" w:hAnsi="Arial"/>
+          <w:sz w:val="22"/>
+          <w:szCs w:val="22"/>
+        </w:rPr>
+        <w:t xml:space="preserve">Un usuario que entra por una plataforma externa tiene inmediatamente una clave privada funcional. El recorrido natural es: usar la clave para responder retos y firmar contenido, acumular reputación bajo esa identidad, y cuando decida tener presencia propia migrar a un dominio con old_identities/ preservando el historial completo:</w:t>
+      </w:r>
+    </w:p>
+    <w:p>
+      <w:pPr>
+        <w:shd w:fill="F0F4F8" w:val="clear"/>
+        <w:spacing w:before="120" w:after="0"/>
+        <w:ind w:left="400" w:right="400"/>
+      </w:pPr>
+    </w:p>
+    <w:p>
+      <w:pPr>
+        <w:shd w:fill="F0F4F8" w:val="clear"/>
+        <w:spacing w:before="0" w:after="0"/>
+        <w:ind w:left="600" w:right="400"/>
+      </w:pPr>
+      <w:r>
+        <w:rPr>
+          <w:rFonts w:ascii="Courier New" w:cs="Courier New" w:eastAsia="Courier New" w:hAnsi="Courier New"/>
+          <w:color w:val="1A3A5C"/>
+          <w:sz w:val="19"/>
+          <w:szCs w:val="19"/>
+        </w:rPr>
+        <w:t xml:space="preserve"># Identidad inicial: derivada del nodo HN</w:t>
+      </w:r>
+    </w:p>
+    <w:p>
+      <w:pPr>
+        <w:shd w:fill="F0F4F8" w:val="clear"/>
+        <w:spacing w:before="0" w:after="0"/>
+        <w:ind w:left="600" w:right="400"/>
+      </w:pPr>
+      <w:r>
+        <w:rPr>
+          <w:rFonts w:ascii="Courier New" w:cs="Courier New" w:eastAsia="Courier New" w:hAnsi="Courier New"/>
+          <w:color w:val="1A3A5C"/>
+          <w:sz w:val="19"/>
+          <w:szCs w:val="19"/>
+        </w:rPr>
+        <w:t xml:space="preserve">old_identity = hn_node.grant_key("dang:private")</w:t>
+      </w:r>
+    </w:p>
+    <w:p>
+      <w:pPr>
+        <w:shd w:fill="F0F4F8" w:val="clear"/>
+        <w:spacing w:before="0" w:after="0"/>
+        <w:ind w:left="600" w:right="400"/>
+      </w:pPr>
+      <w:r>
+        <w:rPr>
+          <w:rFonts w:ascii="Courier New" w:cs="Courier New" w:eastAsia="Courier New" w:hAnsi="Courier New"/>
+          <w:color w:val="1A3A5C"/>
+          <w:sz w:val="19"/>
+          <w:szCs w:val="19"/>
+        </w:rPr>
+        <w:t xml:space="preserve"/>
+      </w:r>
+    </w:p>
+    <w:p>
+      <w:pPr>
+        <w:shd w:fill="F0F4F8" w:val="clear"/>
+        <w:spacing w:before="0" w:after="0"/>
+        <w:ind w:left="600" w:right="400"/>
+      </w:pPr>
+      <w:r>
+        <w:rPr>
+          <w:rFonts w:ascii="Courier New" w:cs="Courier New" w:eastAsia="Courier New" w:hAnsi="Courier New"/>
+          <w:color w:val="1A3A5C"/>
+          <w:sz w:val="19"/>
+          <w:szCs w:val="19"/>
+        </w:rPr>
+        <w:t xml:space="preserve"># Cuando obtiene dominio propio:</w:t>
+      </w:r>
+    </w:p>
+    <w:p>
+      <w:pPr>
+        <w:shd w:fill="F0F4F8" w:val="clear"/>
+        <w:spacing w:before="0" w:after="0"/>
+        <w:ind w:left="600" w:right="400"/>
+      </w:pPr>
+      <w:r>
+        <w:rPr>
+          <w:rFonts w:ascii="Courier New" w:cs="Courier New" w:eastAsia="Courier New" w:hAnsi="Courier New"/>
+          <w:color w:val="1A3A5C"/>
+          <w:sz w:val="19"/>
+          <w:szCs w:val="19"/>
+        </w:rPr>
+        <w:t xml:space="preserve">dang.com/trusteando/old_identities/</w:t>
+      </w:r>
+    </w:p>
+    <w:p>
+      <w:pPr>
+        <w:shd w:fill="F0F4F8" w:val="clear"/>
+        <w:spacing w:before="0" w:after="0"/>
+        <w:ind w:left="600" w:right="400"/>
+      </w:pPr>
+      <w:r>
+        <w:rPr>
+          <w:rFonts w:ascii="Courier New" w:cs="Courier New" w:eastAsia="Courier New" w:hAnsi="Courier New"/>
+          <w:color w:val="1A3A5C"/>
+          <w:sz w:val="19"/>
+          <w:szCs w:val="19"/>
+        </w:rPr>
+        <w:t xml:space="preserve">    └── [new_identity] → [old_hn_identity, ...]   ← historial preservado</w:t>
+      </w:r>
+    </w:p>
+    <w:p>
+      <w:pPr>
+        <w:shd w:fill="F0F4F8" w:val="clear"/>
+        <w:spacing w:before="0" w:after="120"/>
+        <w:ind w:left="400" w:right="400"/>
+      </w:pPr>
+    </w:p>
+    <w:p>
+      <w:pPr>
+        <w:spacing w:before="80" w:after="160"/>
+        <w:jc w:val="both"/>
+      </w:pPr>
+      <w:r>
+        <w:rPr>
+          <w:rFonts w:ascii="Arial" w:cs="Arial" w:eastAsia="Arial" w:hAnsi="Arial"/>
+          <w:sz w:val="22"/>
+          <w:szCs w:val="22"/>
+        </w:rPr>
+        <w:t xml:space="preserve">La reputación acumulada bajo la identidad HN no se pierde — se transfiere. El protocolo no obliga a empezar de cero cuando se da el salto a la identidad autónoma.</w:t>
+      </w:r>
+    </w:p>
+    <w:p>
+      <w:pPr>
+        <w:pStyle w:val="Heading2"/>
+        <w:spacing w:before="320" w:after="140"/>
+      </w:pPr>
+      <w:r>
+        <w:rPr>
+          <w:rFonts w:ascii="Arial" w:cs="Arial" w:eastAsia="Arial" w:hAnsi="Arial"/>
+          <w:b/>
+          <w:bCs/>
+          <w:color w:val="2C3E7A"/>
+          <w:sz w:val="26"/>
+          <w:szCs w:val="26"/>
+        </w:rPr>
+        <w:t xml:space="preserve">7.10.3 Propiedades del mecanismo</w:t>
+      </w:r>
+    </w:p>
+    <w:p>
+      <w:pPr>
+        <w:spacing w:before="80" w:after="160"/>
+        <w:jc w:val="both"/>
+      </w:pPr>
+      <w:r>
+        <w:rPr>
+          <w:rFonts w:ascii="Arial" w:cs="Arial" w:eastAsia="Arial" w:hAnsi="Arial"/>
+          <w:sz w:val="22"/>
+          <w:szCs w:val="22"/>
+        </w:rPr>
+        <w:t xml:space="preserve">Sin registro nuevo: el usuario usa su cuenta existente en la plataforma. Prueba de control: publicar verification_key demuestra control del perfil — solo quien lo controla puede publicar ahí. Sin almacenamiento: el nodo puede rederivir claves cuando las necesita, no guarda estado. Jerarquía natural: el nodo de la plataforma es padre de los usuarios, exactamente el mismo modelo que el resto del protocolo. Privacidad: private_key nunca se revela, ni siquiera al nodo — el usuario responde retos sin exponerla. Uniformidad: no hay caso especial para bootstrapping, es la misma función grant_key con distintos sufijos. Portabilidad futura: el usuario puede migrar a un dominio propio usando old_identities/, preservando el historial completo y la reputación acumulada.</w:t>
+      </w:r>
+    </w:p>
+    <w:p>
+      <w:pPr>
         <w:pStyle w:val="Heading1"/>
         <w:spacing w:before="480" w:after="200"/>
       </w:pPr>
@@ -8997,7 +10668,7 @@
           <w:sz w:val="22"/>
           <w:szCs w:val="22"/>
         </w:rPr>
-        <w:t xml:space="preserve">El diseño base requiere consultar al superior para verificar el HMAC, pero hay tres mecanismos de escalabilidad. Caché firmada: el superior publica listados firmados de sus miembros con TTL, permitiendo verificaciones offline durante ese período. Árboles de Merkle: el superior publica una raíz de Merkle de todos los HMACs válidos; el miembro presenta una prueba junto con su credencial, permitiendo verificación sin consulta online. Múltiples roots y quórum: para credenciales de alto valor se puede requerir validación por un quórum de roots independientes (sección 4.10.4), distribuyendo la carga. Los tres mecanismos están descritos en la sección 4.3.</w:t>
+        <w:t xml:space="preserve">El diseño base requiere consultar al superior para verificar el HMAC, pero hay tres mecanismos de escalabilidad. Caché firmada: el superior publica listados firmados de sus miembros con TTL, permitiendo verificaciones offline durante ese período. Árboles de Merkle: el superior publica una raíz de Merkle de todos los HMACs válidos; el miembro presenta una prueba junto con su credencial, permitiendo verificación sin consulta online. Múltiples roots y quórum: para credenciales de alto valor se puede requerir validación por un quórum de roots independientes (sección 4.10.4), distribuyendo la carga. Los tres mecanismos están descritos en la sección 4.3. La operación de verificación subyacente en todos ellos es la función verify_child_authorship de la clase TrusteandoNode (sección 4.11).</w:t>
       </w:r>
     </w:p>
     <w:p>

</xml_diff>